<commit_message>
Add practice-wide mailbox sweep: search query, staff questioning script, and A4 decision flowchart (site fig. 3 + printable PDF + booklet section)
Co-Authored-By: Claude Fable 5 <noreply@anthropic.com>
</commit_message>
<xml_diff>
--- a/Staff-Training-Booklet-v2.docx
+++ b/Staff-Training-Booklet-v2.docx
@@ -594,6 +594,49 @@
           <w:bCs w:val="false"/>
         </w:rPr>
         <w:t xml:space="preserve">Never assume “it's fine, I know this person”. Knowing the person is exactly what the attack exploits.</w:t>
+      </w:r>
+    </w:p>
+    <w:p>
+      <w:pPr>
+        <w:pStyle w:val="Heading2"/>
+        <w:spacing w:after="120" w:before="240"/>
+      </w:pPr>
+      <w:r>
+        <w:rPr>
+          <w:b/>
+          <w:bCs/>
+          <w:color w:val="00695C"/>
+        </w:rPr>
+        <w:t xml:space="preserve">Monthly sweep: find these emails before anyone clicks</w:t>
+      </w:r>
+    </w:p>
+    <w:p>
+      <w:pPr>
+        <w:spacing w:after="120"/>
+      </w:pPr>
+      <w:r>
+        <w:t xml:space="preserve">Once a month (and any time a colleague warns you), have one person search the practice mailbox — All Mail, not just the inbox — for:</w:t>
+      </w:r>
+    </w:p>
+    <w:p>
+      <w:pPr>
+        <w:spacing w:after="120"/>
+      </w:pPr>
+      <w:r>
+        <w:rPr>
+          <w:rFonts w:ascii="Consolas" w:cs="Consolas" w:eastAsia="Consolas" w:hAnsi="Consolas"/>
+          <w:b/>
+          <w:bCs/>
+        </w:rPr>
+        <w:t xml:space="preserve">“shared a file with you” OR “shared a folder with you” OR “shared a file for you”</w:t>
+      </w:r>
+    </w:p>
+    <w:p>
+      <w:pPr>
+        <w:spacing w:after="120"/>
+      </w:pPr>
+      <w:r>
+        <w:t xml:space="preserve">The same phrase search works in Gmail and Outlook. If anything matches the pattern in this booklet, do NOT click it. Ask every staff member out loud, no blame: Did anyone open this link on any computer? Has any PC shown a strange “Windows Update” screen, a mouse moving by itself, or run hot while idle? Has a colleague asked about an email we don’t remember sending? Nobody opened it → save the email as evidence (Gmail: ⋮ → Download message), report it, delete it. Opened but nothing ran → change the email password and enable 2FA from a different device, and audit mail rules. Something ran or symptoms → treat the machine as infected and follow section 3. A printable one-page flowchart of this sweep is on the Phish Watch site under Resources.</w:t>
       </w:r>
     </w:p>
     <w:p>

</xml_diff>